<commit_message>
Update implementation plan document
Wat heb ik gedaan:

- implementatieplan aangepast omdat Brightspace geen .jar bestanden toestaat
- gewenste eindsituatie aangepast naar starten via IntelliJ of Maven
- startinstructie aangepast naar mvn clean javafx:run
- oplevering aangepast naar GitHub link, SQL export en documentatie
- communicatie, rollback en verificatiecriteria verduidelijkt
- oude jar/artefact verwijzingen weggehaald of aangepast
</commit_message>
<xml_diff>
--- a/docs/FitTrack_Implementatieplan_BP02.docx
+++ b/docs/FitTrack_Implementatieplan_BP02.docx
@@ -147,11 +147,33 @@
                 <w:rFonts w:ascii="Arial" w:hAnsi="Arial" w:cs="Arial"/>
               </w:rPr>
             </w:pPr>
+            <w:proofErr w:type="spellStart"/>
             <w:r>
               <w:rPr>
                 <w:rFonts w:ascii="Arial" w:hAnsi="Arial" w:cs="Arial"/>
               </w:rPr>
-              <w:t>FitTrack (BP2 Realisatie)</w:t>
+              <w:t>FitTrack</w:t>
+            </w:r>
+            <w:proofErr w:type="spellEnd"/>
+            <w:r>
+              <w:rPr>
+                <w:rFonts w:ascii="Arial" w:hAnsi="Arial" w:cs="Arial"/>
+              </w:rPr>
+              <w:t xml:space="preserve"> (BP2 </w:t>
+            </w:r>
+            <w:proofErr w:type="spellStart"/>
+            <w:r>
+              <w:rPr>
+                <w:rFonts w:ascii="Arial" w:hAnsi="Arial" w:cs="Arial"/>
+              </w:rPr>
+              <w:t>Realisatie</w:t>
+            </w:r>
+            <w:proofErr w:type="spellEnd"/>
+            <w:r>
+              <w:rPr>
+                <w:rFonts w:ascii="Arial" w:hAnsi="Arial" w:cs="Arial"/>
+              </w:rPr>
+              <w:t>)</w:t>
             </w:r>
           </w:p>
         </w:tc>
@@ -169,13 +191,23 @@
                 <w:szCs w:val="20"/>
               </w:rPr>
             </w:pPr>
+            <w:proofErr w:type="spellStart"/>
             <w:r>
               <w:rPr>
                 <w:rFonts w:ascii="Arial" w:hAnsi="Arial" w:cs="Arial"/>
                 <w:sz w:val="20"/>
                 <w:szCs w:val="20"/>
               </w:rPr>
-              <w:t>Opgesteld door:</w:t>
+              <w:t>Opgesteld</w:t>
+            </w:r>
+            <w:proofErr w:type="spellEnd"/>
+            <w:r>
+              <w:rPr>
+                <w:rFonts w:ascii="Arial" w:hAnsi="Arial" w:cs="Arial"/>
+                <w:sz w:val="20"/>
+                <w:szCs w:val="20"/>
+              </w:rPr>
+              <w:t xml:space="preserve"> door:</w:t>
             </w:r>
           </w:p>
         </w:tc>
@@ -247,7 +279,21 @@
               <w:rPr>
                 <w:rFonts w:ascii="Arial" w:hAnsi="Arial" w:cs="Arial"/>
               </w:rPr>
-              <w:t xml:space="preserve"> februari 2026</w:t>
+              <w:t xml:space="preserve"> </w:t>
+            </w:r>
+            <w:proofErr w:type="spellStart"/>
+            <w:r>
+              <w:rPr>
+                <w:rFonts w:ascii="Arial" w:hAnsi="Arial" w:cs="Arial"/>
+              </w:rPr>
+              <w:t>februari</w:t>
+            </w:r>
+            <w:proofErr w:type="spellEnd"/>
+            <w:r>
+              <w:rPr>
+                <w:rFonts w:ascii="Arial" w:hAnsi="Arial" w:cs="Arial"/>
+              </w:rPr>
+              <w:t xml:space="preserve"> 2026</w:t>
             </w:r>
           </w:p>
         </w:tc>
@@ -318,6 +364,7 @@
                 <w:szCs w:val="20"/>
               </w:rPr>
             </w:pPr>
+            <w:proofErr w:type="spellStart"/>
             <w:r>
               <w:rPr>
                 <w:rFonts w:ascii="Arial" w:hAnsi="Arial" w:cs="Arial"/>
@@ -326,6 +373,7 @@
               </w:rPr>
               <w:t>Inhoud</w:t>
             </w:r>
+            <w:proofErr w:type="spellEnd"/>
             <w:r>
               <w:rPr>
                 <w:rFonts w:ascii="Arial" w:hAnsi="Arial" w:cs="Arial"/>
@@ -431,21 +479,45 @@
         <w:rPr>
           <w:rFonts w:ascii="Arial" w:hAnsi="Arial" w:cs="Arial"/>
         </w:rPr>
-        <w:t>2. Gewenste eindsituatie</w:t>
+        <w:t xml:space="preserve">2. </w:t>
       </w:r>
+      <w:proofErr w:type="spellStart"/>
+      <w:r>
+        <w:rPr>
+          <w:rFonts w:ascii="Arial" w:hAnsi="Arial" w:cs="Arial"/>
+        </w:rPr>
+        <w:t>Gewenste</w:t>
+      </w:r>
+      <w:proofErr w:type="spellEnd"/>
+      <w:r>
+        <w:rPr>
+          <w:rFonts w:ascii="Arial" w:hAnsi="Arial" w:cs="Arial"/>
+        </w:rPr>
+        <w:t xml:space="preserve"> </w:t>
+      </w:r>
+      <w:proofErr w:type="spellStart"/>
+      <w:r>
+        <w:rPr>
+          <w:rFonts w:ascii="Arial" w:hAnsi="Arial" w:cs="Arial"/>
+        </w:rPr>
+        <w:t>eindsituatie</w:t>
+      </w:r>
+      <w:proofErr w:type="spellEnd"/>
     </w:p>
     <w:p>
       <w:pPr>
         <w:pStyle w:val="ListBullet"/>
         <w:rPr>
           <w:rFonts w:ascii="Arial" w:hAnsi="Arial" w:cs="Arial"/>
+          <w:lang w:val="nl-NL"/>
         </w:rPr>
       </w:pPr>
       <w:r>
         <w:rPr>
           <w:rFonts w:ascii="Arial" w:hAnsi="Arial" w:cs="Arial"/>
-        </w:rPr>
-        <w:t>Werkende applicatie als artefact (jar of executable).</w:t>
+          <w:lang w:val="nl-NL"/>
+        </w:rPr>
+        <w:t>Werkende applicatie via IntelliJ of Maven.</w:t>
       </w:r>
     </w:p>
     <w:p>
@@ -539,7 +611,21 @@
         <w:rPr>
           <w:rFonts w:ascii="Arial" w:hAnsi="Arial" w:cs="Arial"/>
         </w:rPr>
-        <w:t>Clone repo (of download release) op doelmachine.</w:t>
+        <w:t xml:space="preserve">Clone repo (of download release) op </w:t>
+      </w:r>
+      <w:proofErr w:type="spellStart"/>
+      <w:r>
+        <w:rPr>
+          <w:rFonts w:ascii="Arial" w:hAnsi="Arial" w:cs="Arial"/>
+        </w:rPr>
+        <w:t>doelmachine</w:t>
+      </w:r>
+      <w:proofErr w:type="spellEnd"/>
+      <w:r>
+        <w:rPr>
+          <w:rFonts w:ascii="Arial" w:hAnsi="Arial" w:cs="Arial"/>
+        </w:rPr>
+        <w:t>.</w:t>
       </w:r>
     </w:p>
     <w:p>
@@ -565,18 +651,28 @@
           <w:rFonts w:ascii="Arial" w:hAnsi="Arial" w:cs="Arial"/>
         </w:rPr>
       </w:pPr>
+      <w:proofErr w:type="spellStart"/>
       <w:r>
         <w:rPr>
           <w:rFonts w:ascii="Arial" w:hAnsi="Arial" w:cs="Arial"/>
         </w:rPr>
-        <w:t>Importeer `</w:t>
+        <w:t>Importeer</w:t>
       </w:r>
+      <w:proofErr w:type="spellEnd"/>
+      <w:r>
+        <w:rPr>
+          <w:rFonts w:ascii="Arial" w:hAnsi="Arial" w:cs="Arial"/>
+        </w:rPr>
+        <w:t xml:space="preserve"> `</w:t>
+      </w:r>
+      <w:proofErr w:type="spellStart"/>
       <w:r>
         <w:rPr>
           <w:rFonts w:ascii="Arial" w:hAnsi="Arial" w:cs="Arial"/>
         </w:rPr>
         <w:t>fittrack.sql</w:t>
       </w:r>
+      <w:proofErr w:type="spellEnd"/>
       <w:r>
         <w:rPr>
           <w:rFonts w:ascii="Arial" w:hAnsi="Arial" w:cs="Arial"/>
@@ -591,11 +687,33 @@
           <w:rFonts w:ascii="Arial" w:hAnsi="Arial" w:cs="Arial"/>
         </w:rPr>
       </w:pPr>
+      <w:proofErr w:type="spellStart"/>
       <w:r>
         <w:rPr>
           <w:rFonts w:ascii="Arial" w:hAnsi="Arial" w:cs="Arial"/>
         </w:rPr>
-        <w:t>Configureer database connectie (Database.java of config).</w:t>
+        <w:t>Configureer</w:t>
+      </w:r>
+      <w:proofErr w:type="spellEnd"/>
+      <w:r>
+        <w:rPr>
+          <w:rFonts w:ascii="Arial" w:hAnsi="Arial" w:cs="Arial"/>
+        </w:rPr>
+        <w:t xml:space="preserve"> database </w:t>
+      </w:r>
+      <w:proofErr w:type="spellStart"/>
+      <w:r>
+        <w:rPr>
+          <w:rFonts w:ascii="Arial" w:hAnsi="Arial" w:cs="Arial"/>
+        </w:rPr>
+        <w:t>connectie</w:t>
+      </w:r>
+      <w:proofErr w:type="spellEnd"/>
+      <w:r>
+        <w:rPr>
+          <w:rFonts w:ascii="Arial" w:hAnsi="Arial" w:cs="Arial"/>
+        </w:rPr>
+        <w:t xml:space="preserve"> (Database.java of config).</w:t>
       </w:r>
     </w:p>
     <w:p>
@@ -609,7 +727,21 @@
         <w:rPr>
           <w:rFonts w:ascii="Arial" w:hAnsi="Arial" w:cs="Arial"/>
         </w:rPr>
-        <w:t>Build &amp; test: `mvn clean test package` (of run via IntelliJ).</w:t>
+        <w:t>Build &amp; test: `</w:t>
+      </w:r>
+      <w:proofErr w:type="spellStart"/>
+      <w:r>
+        <w:rPr>
+          <w:rFonts w:ascii="Arial" w:hAnsi="Arial" w:cs="Arial"/>
+        </w:rPr>
+        <w:t>mvn</w:t>
+      </w:r>
+      <w:proofErr w:type="spellEnd"/>
+      <w:r>
+        <w:rPr>
+          <w:rFonts w:ascii="Arial" w:hAnsi="Arial" w:cs="Arial"/>
+        </w:rPr>
+        <w:t xml:space="preserve"> clean test package` (of run via IntelliJ).</w:t>
       </w:r>
     </w:p>
     <w:p>
@@ -623,7 +755,49 @@
         <w:rPr>
           <w:rFonts w:ascii="Arial" w:hAnsi="Arial" w:cs="Arial"/>
         </w:rPr>
-        <w:t>Start applicatie (java -jar ...).</w:t>
+        <w:t xml:space="preserve">Start </w:t>
+      </w:r>
+      <w:proofErr w:type="spellStart"/>
+      <w:r>
+        <w:rPr>
+          <w:rFonts w:ascii="Arial" w:hAnsi="Arial" w:cs="Arial"/>
+        </w:rPr>
+        <w:t>applicatie</w:t>
+      </w:r>
+      <w:proofErr w:type="spellEnd"/>
+      <w:r>
+        <w:rPr>
+          <w:rFonts w:ascii="Arial" w:hAnsi="Arial" w:cs="Arial"/>
+        </w:rPr>
+        <w:t xml:space="preserve"> via IntelliJ of met Maven: </w:t>
+      </w:r>
+      <w:proofErr w:type="spellStart"/>
+      <w:r>
+        <w:rPr>
+          <w:rFonts w:ascii="Arial" w:hAnsi="Arial" w:cs="Arial"/>
+        </w:rPr>
+        <w:t>mvn</w:t>
+      </w:r>
+      <w:proofErr w:type="spellEnd"/>
+      <w:r>
+        <w:rPr>
+          <w:rFonts w:ascii="Arial" w:hAnsi="Arial" w:cs="Arial"/>
+        </w:rPr>
+        <w:t xml:space="preserve"> clean </w:t>
+      </w:r>
+      <w:proofErr w:type="spellStart"/>
+      <w:r>
+        <w:rPr>
+          <w:rFonts w:ascii="Arial" w:hAnsi="Arial" w:cs="Arial"/>
+        </w:rPr>
+        <w:t>javafx:run</w:t>
+      </w:r>
+      <w:proofErr w:type="spellEnd"/>
+      <w:r>
+        <w:rPr>
+          <w:rFonts w:ascii="Arial" w:hAnsi="Arial" w:cs="Arial"/>
+        </w:rPr>
+        <w:t>.</w:t>
       </w:r>
     </w:p>
     <w:p>
@@ -631,13 +805,21 @@
         <w:pStyle w:val="ListNumber"/>
         <w:rPr>
           <w:rFonts w:ascii="Arial" w:hAnsi="Arial" w:cs="Arial"/>
+          <w:lang w:val="nl-NL"/>
         </w:rPr>
       </w:pPr>
       <w:r>
         <w:rPr>
           <w:rFonts w:ascii="Arial" w:hAnsi="Arial" w:cs="Arial"/>
-        </w:rPr>
-        <w:t>Smoke test: maak user aan, voeg workout + meal toe, check overview.</w:t>
+          <w:lang w:val="nl-NL"/>
+        </w:rPr>
+        <w:t>Smoke test: maak user aan, voeg workout + meal toe, check overview</w:t>
+      </w:r>
+      <w:r>
+        <w:rPr>
+          <w:rFonts w:ascii="Arial" w:hAnsi="Arial" w:cs="Arial"/>
+        </w:rPr>
+        <w:t>.</w:t>
       </w:r>
     </w:p>
     <w:p>
@@ -645,24 +827,20 @@
         <w:pStyle w:val="ListNumber"/>
         <w:rPr>
           <w:rFonts w:ascii="Arial" w:hAnsi="Arial" w:cs="Arial"/>
+          <w:lang w:val="nl-NL"/>
         </w:rPr>
       </w:pPr>
       <w:r>
         <w:rPr>
           <w:rFonts w:ascii="Arial" w:hAnsi="Arial" w:cs="Arial"/>
-        </w:rPr>
-        <w:t>Oplevering: commit/push laatste versie, deel GitHub link + artefact + SQL export via Brightspace.</w:t>
+          <w:lang w:val="nl-NL"/>
+        </w:rPr>
+        <w:t>Oplevering: commit/push laatste versie, deel GitHub link, SQL export en documentatie via Brightspace.</w:t>
       </w:r>
-    </w:p>
-    <w:p>
-      <w:pPr>
-        <w:rPr>
-          <w:rFonts w:ascii="Arial" w:hAnsi="Arial" w:cs="Arial"/>
-        </w:rPr>
-      </w:pPr>
       <w:r>
         <w:rPr>
           <w:rFonts w:ascii="Arial" w:hAnsi="Arial" w:cs="Arial"/>
+          <w:lang w:val="nl-NL"/>
         </w:rPr>
         <w:br w:type="page"/>
       </w:r>
@@ -679,8 +857,16 @@
           <w:rFonts w:ascii="Arial" w:hAnsi="Arial" w:cs="Arial"/>
         </w:rPr>
         <w:lastRenderedPageBreak/>
-        <w:t>4. Tijdlijn</w:t>
+        <w:t xml:space="preserve">4. </w:t>
       </w:r>
+      <w:proofErr w:type="spellStart"/>
+      <w:r>
+        <w:rPr>
+          <w:rFonts w:ascii="Arial" w:hAnsi="Arial" w:cs="Arial"/>
+        </w:rPr>
+        <w:t>Tijdlijn</w:t>
+      </w:r>
+      <w:proofErr w:type="spellEnd"/>
     </w:p>
     <w:tbl>
       <w:tblPr>
@@ -720,8 +906,18 @@
                 <w:b/>
                 <w:bCs/>
               </w:rPr>
-              <w:t>Datum/Periode</w:t>
+              <w:t>Datum/</w:t>
             </w:r>
+            <w:proofErr w:type="spellStart"/>
+            <w:r>
+              <w:rPr>
+                <w:rFonts w:ascii="Arial" w:hAnsi="Arial" w:cs="Arial"/>
+                <w:b/>
+                <w:bCs/>
+              </w:rPr>
+              <w:t>Periode</w:t>
+            </w:r>
+            <w:proofErr w:type="spellEnd"/>
           </w:p>
         </w:tc>
         <w:tc>
@@ -736,6 +932,7 @@
                 <w:bCs/>
               </w:rPr>
             </w:pPr>
+            <w:proofErr w:type="spellStart"/>
             <w:r>
               <w:rPr>
                 <w:rFonts w:ascii="Arial" w:hAnsi="Arial" w:cs="Arial"/>
@@ -744,6 +941,7 @@
               </w:rPr>
               <w:t>Activiteit</w:t>
             </w:r>
+            <w:proofErr w:type="spellEnd"/>
           </w:p>
         </w:tc>
         <w:tc>
@@ -824,7 +1022,21 @@
               <w:rPr>
                 <w:rFonts w:ascii="Arial" w:hAnsi="Arial" w:cs="Arial"/>
               </w:rPr>
-              <w:t>Database structuur + indexes/FK’s</w:t>
+              <w:t xml:space="preserve">Database </w:t>
+            </w:r>
+            <w:proofErr w:type="spellStart"/>
+            <w:r>
+              <w:rPr>
+                <w:rFonts w:ascii="Arial" w:hAnsi="Arial" w:cs="Arial"/>
+              </w:rPr>
+              <w:t>structuur</w:t>
+            </w:r>
+            <w:proofErr w:type="spellEnd"/>
+            <w:r>
+              <w:rPr>
+                <w:rFonts w:ascii="Arial" w:hAnsi="Arial" w:cs="Arial"/>
+              </w:rPr>
+              <w:t xml:space="preserve"> + indexes/FK’s</w:t>
             </w:r>
           </w:p>
         </w:tc>
@@ -898,7 +1110,21 @@
               <w:rPr>
                 <w:rFonts w:ascii="Arial" w:hAnsi="Arial" w:cs="Arial"/>
               </w:rPr>
-              <w:t>JDBC koppeling + DAO CRUD</w:t>
+              <w:t xml:space="preserve">JDBC </w:t>
+            </w:r>
+            <w:proofErr w:type="spellStart"/>
+            <w:r>
+              <w:rPr>
+                <w:rFonts w:ascii="Arial" w:hAnsi="Arial" w:cs="Arial"/>
+              </w:rPr>
+              <w:t>koppeling</w:t>
+            </w:r>
+            <w:proofErr w:type="spellEnd"/>
+            <w:r>
+              <w:rPr>
+                <w:rFonts w:ascii="Arial" w:hAnsi="Arial" w:cs="Arial"/>
+              </w:rPr>
+              <w:t xml:space="preserve"> + DAO CRUD</w:t>
             </w:r>
           </w:p>
         </w:tc>
@@ -930,11 +1156,123 @@
                 <w:rFonts w:ascii="Arial" w:hAnsi="Arial" w:cs="Arial"/>
               </w:rPr>
             </w:pPr>
+            <w:proofErr w:type="spellStart"/>
             <w:r>
               <w:rPr>
                 <w:rFonts w:ascii="Arial" w:hAnsi="Arial" w:cs="Arial"/>
               </w:rPr>
-              <w:t>Werkende DB-laag</w:t>
+              <w:t>Werkende</w:t>
+            </w:r>
+            <w:proofErr w:type="spellEnd"/>
+            <w:r>
+              <w:rPr>
+                <w:rFonts w:ascii="Arial" w:hAnsi="Arial" w:cs="Arial"/>
+              </w:rPr>
+              <w:t xml:space="preserve"> DB-</w:t>
+            </w:r>
+            <w:proofErr w:type="spellStart"/>
+            <w:r>
+              <w:rPr>
+                <w:rFonts w:ascii="Arial" w:hAnsi="Arial" w:cs="Arial"/>
+              </w:rPr>
+              <w:t>laag</w:t>
+            </w:r>
+            <w:proofErr w:type="spellEnd"/>
+          </w:p>
+        </w:tc>
+      </w:tr>
+      <w:tr>
+        <w:tc>
+          <w:tcPr>
+            <w:tcW w:w="2160" w:type="dxa"/>
+          </w:tcPr>
+          <w:p>
+            <w:pPr>
+              <w:rPr>
+                <w:rFonts w:ascii="Arial" w:hAnsi="Arial" w:cs="Arial"/>
+              </w:rPr>
+            </w:pPr>
+            <w:r>
+              <w:rPr>
+                <w:rFonts w:ascii="Arial" w:hAnsi="Arial" w:cs="Arial"/>
+              </w:rPr>
+              <w:t>Dag 3</w:t>
+            </w:r>
+          </w:p>
+        </w:tc>
+        <w:tc>
+          <w:tcPr>
+            <w:tcW w:w="2160" w:type="dxa"/>
+          </w:tcPr>
+          <w:p>
+            <w:pPr>
+              <w:rPr>
+                <w:rFonts w:ascii="Arial" w:hAnsi="Arial" w:cs="Arial"/>
+              </w:rPr>
+            </w:pPr>
+            <w:r>
+              <w:rPr>
+                <w:rFonts w:ascii="Arial" w:hAnsi="Arial" w:cs="Arial"/>
+              </w:rPr>
+              <w:t xml:space="preserve">JavaFX </w:t>
+            </w:r>
+            <w:proofErr w:type="spellStart"/>
+            <w:r>
+              <w:rPr>
+                <w:rFonts w:ascii="Arial" w:hAnsi="Arial" w:cs="Arial"/>
+              </w:rPr>
+              <w:t>schermen</w:t>
+            </w:r>
+            <w:proofErr w:type="spellEnd"/>
+            <w:r>
+              <w:rPr>
+                <w:rFonts w:ascii="Arial" w:hAnsi="Arial" w:cs="Arial"/>
+              </w:rPr>
+              <w:t xml:space="preserve"> + dialogs</w:t>
+            </w:r>
+          </w:p>
+        </w:tc>
+        <w:tc>
+          <w:tcPr>
+            <w:tcW w:w="2160" w:type="dxa"/>
+          </w:tcPr>
+          <w:p>
+            <w:pPr>
+              <w:rPr>
+                <w:rFonts w:ascii="Arial" w:hAnsi="Arial" w:cs="Arial"/>
+              </w:rPr>
+            </w:pPr>
+            <w:r>
+              <w:rPr>
+                <w:rFonts w:ascii="Arial" w:hAnsi="Arial" w:cs="Arial"/>
+              </w:rPr>
+              <w:t>Student</w:t>
+            </w:r>
+          </w:p>
+        </w:tc>
+        <w:tc>
+          <w:tcPr>
+            <w:tcW w:w="2160" w:type="dxa"/>
+          </w:tcPr>
+          <w:p>
+            <w:pPr>
+              <w:rPr>
+                <w:rFonts w:ascii="Arial" w:hAnsi="Arial" w:cs="Arial"/>
+              </w:rPr>
+            </w:pPr>
+            <w:proofErr w:type="spellStart"/>
+            <w:r>
+              <w:rPr>
+                <w:rFonts w:ascii="Arial" w:hAnsi="Arial" w:cs="Arial"/>
+              </w:rPr>
+              <w:t>Werkende</w:t>
+            </w:r>
+            <w:proofErr w:type="spellEnd"/>
+            <w:r>
+              <w:rPr>
+                <w:rFonts w:ascii="Arial" w:hAnsi="Arial" w:cs="Arial"/>
+              </w:rPr>
+              <w:t xml:space="preserve"> UI</w:t>
             </w:r>
           </w:p>
         </w:tc>
@@ -954,7 +1292,7 @@
               <w:rPr>
                 <w:rFonts w:ascii="Arial" w:hAnsi="Arial" w:cs="Arial"/>
               </w:rPr>
-              <w:t>Dag 3</w:t>
+              <w:t>Dag 4</w:t>
             </w:r>
           </w:p>
         </w:tc>
@@ -972,7 +1310,7 @@
               <w:rPr>
                 <w:rFonts w:ascii="Arial" w:hAnsi="Arial" w:cs="Arial"/>
               </w:rPr>
-              <w:t>JavaFX schermen + dialogs</w:t>
+              <w:t>Rapportage queries (JOIN/GROUP BY/ORDER BY + extra clause)</w:t>
             </w:r>
           </w:p>
         </w:tc>
@@ -1004,12 +1342,14 @@
                 <w:rFonts w:ascii="Arial" w:hAnsi="Arial" w:cs="Arial"/>
               </w:rPr>
             </w:pPr>
+            <w:proofErr w:type="spellStart"/>
             <w:r>
               <w:rPr>
                 <w:rFonts w:ascii="Arial" w:hAnsi="Arial" w:cs="Arial"/>
               </w:rPr>
-              <w:t>Werkende UI</w:t>
+              <w:t>Overzichten</w:t>
             </w:r>
+            <w:proofErr w:type="spellEnd"/>
           </w:p>
         </w:tc>
       </w:tr>
@@ -1028,80 +1368,6 @@
               <w:rPr>
                 <w:rFonts w:ascii="Arial" w:hAnsi="Arial" w:cs="Arial"/>
               </w:rPr>
-              <w:t>Dag 4</w:t>
-            </w:r>
-          </w:p>
-        </w:tc>
-        <w:tc>
-          <w:tcPr>
-            <w:tcW w:w="2160" w:type="dxa"/>
-          </w:tcPr>
-          <w:p>
-            <w:pPr>
-              <w:rPr>
-                <w:rFonts w:ascii="Arial" w:hAnsi="Arial" w:cs="Arial"/>
-              </w:rPr>
-            </w:pPr>
-            <w:r>
-              <w:rPr>
-                <w:rFonts w:ascii="Arial" w:hAnsi="Arial" w:cs="Arial"/>
-              </w:rPr>
-              <w:t>Rapportage queries (JOIN/GROUP BY/ORDER BY + extra clause)</w:t>
-            </w:r>
-          </w:p>
-        </w:tc>
-        <w:tc>
-          <w:tcPr>
-            <w:tcW w:w="2160" w:type="dxa"/>
-          </w:tcPr>
-          <w:p>
-            <w:pPr>
-              <w:rPr>
-                <w:rFonts w:ascii="Arial" w:hAnsi="Arial" w:cs="Arial"/>
-              </w:rPr>
-            </w:pPr>
-            <w:r>
-              <w:rPr>
-                <w:rFonts w:ascii="Arial" w:hAnsi="Arial" w:cs="Arial"/>
-              </w:rPr>
-              <w:t>Student</w:t>
-            </w:r>
-          </w:p>
-        </w:tc>
-        <w:tc>
-          <w:tcPr>
-            <w:tcW w:w="2160" w:type="dxa"/>
-          </w:tcPr>
-          <w:p>
-            <w:pPr>
-              <w:rPr>
-                <w:rFonts w:ascii="Arial" w:hAnsi="Arial" w:cs="Arial"/>
-              </w:rPr>
-            </w:pPr>
-            <w:r>
-              <w:rPr>
-                <w:rFonts w:ascii="Arial" w:hAnsi="Arial" w:cs="Arial"/>
-              </w:rPr>
-              <w:t>Overzichten</w:t>
-            </w:r>
-          </w:p>
-        </w:tc>
-      </w:tr>
-      <w:tr>
-        <w:tc>
-          <w:tcPr>
-            <w:tcW w:w="2160" w:type="dxa"/>
-          </w:tcPr>
-          <w:p>
-            <w:pPr>
-              <w:rPr>
-                <w:rFonts w:ascii="Arial" w:hAnsi="Arial" w:cs="Arial"/>
-              </w:rPr>
-            </w:pPr>
-            <w:r>
-              <w:rPr>
-                <w:rFonts w:ascii="Arial" w:hAnsi="Arial" w:cs="Arial"/>
-              </w:rPr>
               <w:t>Dag 5</w:t>
             </w:r>
           </w:p>
@@ -1120,8 +1386,16 @@
               <w:rPr>
                 <w:rFonts w:ascii="Arial" w:hAnsi="Arial" w:cs="Arial"/>
               </w:rPr>
-              <w:t>Unit tests uitbreiden</w:t>
+              <w:t xml:space="preserve">Unit tests </w:t>
             </w:r>
+            <w:proofErr w:type="spellStart"/>
+            <w:r>
+              <w:rPr>
+                <w:rFonts w:ascii="Arial" w:hAnsi="Arial" w:cs="Arial"/>
+              </w:rPr>
+              <w:t>uitbreiden</w:t>
+            </w:r>
+            <w:proofErr w:type="spellEnd"/>
           </w:p>
         </w:tc>
         <w:tc>
@@ -1190,12 +1464,56 @@
                 <w:rFonts w:ascii="Arial" w:hAnsi="Arial" w:cs="Arial"/>
               </w:rPr>
             </w:pPr>
+            <w:proofErr w:type="spellStart"/>
             <w:r>
               <w:rPr>
                 <w:rFonts w:ascii="Arial" w:hAnsi="Arial" w:cs="Arial"/>
               </w:rPr>
-              <w:t>Acceptatietest uitvoeren + documenten invullen</w:t>
+              <w:t>Acceptatietest</w:t>
             </w:r>
+            <w:proofErr w:type="spellEnd"/>
+            <w:r>
+              <w:rPr>
+                <w:rFonts w:ascii="Arial" w:hAnsi="Arial" w:cs="Arial"/>
+              </w:rPr>
+              <w:t xml:space="preserve"> </w:t>
+            </w:r>
+            <w:proofErr w:type="spellStart"/>
+            <w:r>
+              <w:rPr>
+                <w:rFonts w:ascii="Arial" w:hAnsi="Arial" w:cs="Arial"/>
+              </w:rPr>
+              <w:t>uitvoeren</w:t>
+            </w:r>
+            <w:proofErr w:type="spellEnd"/>
+            <w:r>
+              <w:rPr>
+                <w:rFonts w:ascii="Arial" w:hAnsi="Arial" w:cs="Arial"/>
+              </w:rPr>
+              <w:t xml:space="preserve"> + </w:t>
+            </w:r>
+            <w:proofErr w:type="spellStart"/>
+            <w:r>
+              <w:rPr>
+                <w:rFonts w:ascii="Arial" w:hAnsi="Arial" w:cs="Arial"/>
+              </w:rPr>
+              <w:t>documenten</w:t>
+            </w:r>
+            <w:proofErr w:type="spellEnd"/>
+            <w:r>
+              <w:rPr>
+                <w:rFonts w:ascii="Arial" w:hAnsi="Arial" w:cs="Arial"/>
+              </w:rPr>
+              <w:t xml:space="preserve"> </w:t>
+            </w:r>
+            <w:proofErr w:type="spellStart"/>
+            <w:r>
+              <w:rPr>
+                <w:rFonts w:ascii="Arial" w:hAnsi="Arial" w:cs="Arial"/>
+              </w:rPr>
+              <w:t>invullen</w:t>
+            </w:r>
+            <w:proofErr w:type="spellEnd"/>
           </w:p>
         </w:tc>
         <w:tc>
@@ -1230,8 +1548,16 @@
               <w:rPr>
                 <w:rFonts w:ascii="Arial" w:hAnsi="Arial" w:cs="Arial"/>
               </w:rPr>
-              <w:t>Spreadsheet + testrapport</w:t>
+              <w:t xml:space="preserve">Spreadsheet + </w:t>
             </w:r>
+            <w:proofErr w:type="spellStart"/>
+            <w:r>
+              <w:rPr>
+                <w:rFonts w:ascii="Arial" w:hAnsi="Arial" w:cs="Arial"/>
+              </w:rPr>
+              <w:t>testrapport</w:t>
+            </w:r>
+            <w:proofErr w:type="spellEnd"/>
           </w:p>
         </w:tc>
       </w:tr>
@@ -1264,12 +1590,56 @@
                 <w:rFonts w:ascii="Arial" w:hAnsi="Arial" w:cs="Arial"/>
               </w:rPr>
             </w:pPr>
+            <w:proofErr w:type="spellStart"/>
             <w:r>
               <w:rPr>
                 <w:rFonts w:ascii="Arial" w:hAnsi="Arial" w:cs="Arial"/>
               </w:rPr>
-              <w:t>Build artefact + inleveren</w:t>
+              <w:t>Laatste</w:t>
             </w:r>
+            <w:proofErr w:type="spellEnd"/>
+            <w:r>
+              <w:rPr>
+                <w:rFonts w:ascii="Arial" w:hAnsi="Arial" w:cs="Arial"/>
+              </w:rPr>
+              <w:t xml:space="preserve"> </w:t>
+            </w:r>
+            <w:proofErr w:type="spellStart"/>
+            <w:r>
+              <w:rPr>
+                <w:rFonts w:ascii="Arial" w:hAnsi="Arial" w:cs="Arial"/>
+              </w:rPr>
+              <w:t>versie</w:t>
+            </w:r>
+            <w:proofErr w:type="spellEnd"/>
+            <w:r>
+              <w:rPr>
+                <w:rFonts w:ascii="Arial" w:hAnsi="Arial" w:cs="Arial"/>
+              </w:rPr>
+              <w:t xml:space="preserve"> </w:t>
+            </w:r>
+            <w:proofErr w:type="spellStart"/>
+            <w:r>
+              <w:rPr>
+                <w:rFonts w:ascii="Arial" w:hAnsi="Arial" w:cs="Arial"/>
+              </w:rPr>
+              <w:t>controleren</w:t>
+            </w:r>
+            <w:proofErr w:type="spellEnd"/>
+            <w:r>
+              <w:rPr>
+                <w:rFonts w:ascii="Arial" w:hAnsi="Arial" w:cs="Arial"/>
+              </w:rPr>
+              <w:t xml:space="preserve"> + </w:t>
+            </w:r>
+            <w:proofErr w:type="spellStart"/>
+            <w:r>
+              <w:rPr>
+                <w:rFonts w:ascii="Arial" w:hAnsi="Arial" w:cs="Arial"/>
+              </w:rPr>
+              <w:t>inleveren</w:t>
+            </w:r>
+            <w:proofErr w:type="spellEnd"/>
           </w:p>
         </w:tc>
         <w:tc>
@@ -1304,8 +1674,16 @@
               <w:rPr>
                 <w:rFonts w:ascii="Arial" w:hAnsi="Arial" w:cs="Arial"/>
               </w:rPr>
-              <w:t>Jar/exe + repo</w:t>
+              <w:t xml:space="preserve">GitHub repo + SQL export + </w:t>
             </w:r>
+            <w:proofErr w:type="spellStart"/>
+            <w:r>
+              <w:rPr>
+                <w:rFonts w:ascii="Arial" w:hAnsi="Arial" w:cs="Arial"/>
+              </w:rPr>
+              <w:t>documenten</w:t>
+            </w:r>
+            <w:proofErr w:type="spellEnd"/>
           </w:p>
         </w:tc>
       </w:tr>
@@ -1321,8 +1699,16 @@
         <w:rPr>
           <w:rFonts w:ascii="Arial" w:hAnsi="Arial" w:cs="Arial"/>
         </w:rPr>
-        <w:t>5. Communicatie</w:t>
+        <w:t xml:space="preserve">5. </w:t>
       </w:r>
+      <w:proofErr w:type="spellStart"/>
+      <w:r>
+        <w:rPr>
+          <w:rFonts w:ascii="Arial" w:hAnsi="Arial" w:cs="Arial"/>
+        </w:rPr>
+        <w:t>Communicatie</w:t>
+      </w:r>
+      <w:proofErr w:type="spellEnd"/>
     </w:p>
     <w:p>
       <w:pPr>
@@ -1353,7 +1739,7 @@
           <w:rFonts w:ascii="Arial" w:hAnsi="Arial" w:cs="Arial"/>
           <w:lang w:val="nl-NL"/>
         </w:rPr>
-        <w:t>Bij oplevering: GitHub link + artefact + SQL export delen via Brightspace.</w:t>
+        <w:t>Bij oplevering: GitHub link, SQL export en documentatie delen via Brightspace.</w:t>
       </w:r>
     </w:p>
     <w:p>
@@ -1361,11 +1747,13 @@
         <w:pStyle w:val="ListBullet"/>
         <w:rPr>
           <w:rFonts w:ascii="Arial" w:hAnsi="Arial" w:cs="Arial"/>
+          <w:lang w:val="nl-NL"/>
         </w:rPr>
       </w:pPr>
       <w:r>
         <w:rPr>
           <w:rFonts w:ascii="Arial" w:hAnsi="Arial" w:cs="Arial"/>
+          <w:lang w:val="nl-NL"/>
         </w:rPr>
         <w:t>Bij issues: foutmelding + screenshot delen en fix committen.</w:t>
       </w:r>
@@ -1381,8 +1769,44 @@
         <w:rPr>
           <w:rFonts w:ascii="Arial" w:hAnsi="Arial" w:cs="Arial"/>
         </w:rPr>
-        <w:t>6. Evaluatie en verificatie</w:t>
+        <w:t xml:space="preserve">6. </w:t>
       </w:r>
+      <w:proofErr w:type="spellStart"/>
+      <w:r>
+        <w:rPr>
+          <w:rFonts w:ascii="Arial" w:hAnsi="Arial" w:cs="Arial"/>
+        </w:rPr>
+        <w:t>Evaluatie</w:t>
+      </w:r>
+      <w:proofErr w:type="spellEnd"/>
+      <w:r>
+        <w:rPr>
+          <w:rFonts w:ascii="Arial" w:hAnsi="Arial" w:cs="Arial"/>
+        </w:rPr>
+        <w:t xml:space="preserve"> </w:t>
+      </w:r>
+      <w:proofErr w:type="spellStart"/>
+      <w:r>
+        <w:rPr>
+          <w:rFonts w:ascii="Arial" w:hAnsi="Arial" w:cs="Arial"/>
+        </w:rPr>
+        <w:t>en</w:t>
+      </w:r>
+      <w:proofErr w:type="spellEnd"/>
+      <w:r>
+        <w:rPr>
+          <w:rFonts w:ascii="Arial" w:hAnsi="Arial" w:cs="Arial"/>
+        </w:rPr>
+        <w:t xml:space="preserve"> </w:t>
+      </w:r>
+      <w:proofErr w:type="spellStart"/>
+      <w:r>
+        <w:rPr>
+          <w:rFonts w:ascii="Arial" w:hAnsi="Arial" w:cs="Arial"/>
+        </w:rPr>
+        <w:t>verificatie</w:t>
+      </w:r>
+      <w:proofErr w:type="spellEnd"/>
     </w:p>
     <w:p>
       <w:pPr>
@@ -1390,11 +1814,33 @@
           <w:rFonts w:ascii="Arial" w:hAnsi="Arial" w:cs="Arial"/>
         </w:rPr>
       </w:pPr>
+      <w:proofErr w:type="spellStart"/>
       <w:r>
         <w:rPr>
           <w:rFonts w:ascii="Arial" w:hAnsi="Arial" w:cs="Arial"/>
         </w:rPr>
-        <w:t>Verificatie gebeurt met:</w:t>
+        <w:t>Verificatie</w:t>
+      </w:r>
+      <w:proofErr w:type="spellEnd"/>
+      <w:r>
+        <w:rPr>
+          <w:rFonts w:ascii="Arial" w:hAnsi="Arial" w:cs="Arial"/>
+        </w:rPr>
+        <w:t xml:space="preserve"> </w:t>
+      </w:r>
+      <w:proofErr w:type="spellStart"/>
+      <w:r>
+        <w:rPr>
+          <w:rFonts w:ascii="Arial" w:hAnsi="Arial" w:cs="Arial"/>
+        </w:rPr>
+        <w:t>gebeurt</w:t>
+      </w:r>
+      <w:proofErr w:type="spellEnd"/>
+      <w:r>
+        <w:rPr>
+          <w:rFonts w:ascii="Arial" w:hAnsi="Arial" w:cs="Arial"/>
+        </w:rPr>
+        <w:t xml:space="preserve"> met:</w:t>
       </w:r>
     </w:p>
     <w:p>
@@ -1408,7 +1854,21 @@
         <w:rPr>
           <w:rFonts w:ascii="Arial" w:hAnsi="Arial" w:cs="Arial"/>
         </w:rPr>
-        <w:t>Smoke test na deployment</w:t>
+        <w:t xml:space="preserve">Smoke test </w:t>
+      </w:r>
+      <w:proofErr w:type="spellStart"/>
+      <w:r>
+        <w:rPr>
+          <w:rFonts w:ascii="Arial" w:hAnsi="Arial" w:cs="Arial"/>
+        </w:rPr>
+        <w:t>na</w:t>
+      </w:r>
+      <w:proofErr w:type="spellEnd"/>
+      <w:r>
+        <w:rPr>
+          <w:rFonts w:ascii="Arial" w:hAnsi="Arial" w:cs="Arial"/>
+        </w:rPr>
+        <w:t xml:space="preserve"> deployment</w:t>
       </w:r>
     </w:p>
     <w:p>
@@ -1418,11 +1878,19 @@
           <w:rFonts w:ascii="Arial" w:hAnsi="Arial" w:cs="Arial"/>
         </w:rPr>
       </w:pPr>
+      <w:proofErr w:type="spellStart"/>
       <w:r>
         <w:rPr>
           <w:rFonts w:ascii="Arial" w:hAnsi="Arial" w:cs="Arial"/>
         </w:rPr>
-        <w:t>Testgevallen spreadsheet (PASS/FAIL per test)</w:t>
+        <w:t>Testgevallen</w:t>
+      </w:r>
+      <w:proofErr w:type="spellEnd"/>
+      <w:r>
+        <w:rPr>
+          <w:rFonts w:ascii="Arial" w:hAnsi="Arial" w:cs="Arial"/>
+        </w:rPr>
+        <w:t xml:space="preserve"> spreadsheet (PASS/FAIL per test)</w:t>
       </w:r>
     </w:p>
     <w:p>
@@ -1432,11 +1900,33 @@
           <w:rFonts w:ascii="Arial" w:hAnsi="Arial" w:cs="Arial"/>
         </w:rPr>
       </w:pPr>
+      <w:proofErr w:type="spellStart"/>
       <w:r>
         <w:rPr>
           <w:rFonts w:ascii="Arial" w:hAnsi="Arial" w:cs="Arial"/>
         </w:rPr>
-        <w:t>Acceptatietest rapport (samenvatting)</w:t>
+        <w:t>Acceptatietest</w:t>
+      </w:r>
+      <w:proofErr w:type="spellEnd"/>
+      <w:r>
+        <w:rPr>
+          <w:rFonts w:ascii="Arial" w:hAnsi="Arial" w:cs="Arial"/>
+        </w:rPr>
+        <w:t xml:space="preserve"> rapport (</w:t>
+      </w:r>
+      <w:proofErr w:type="spellStart"/>
+      <w:r>
+        <w:rPr>
+          <w:rFonts w:ascii="Arial" w:hAnsi="Arial" w:cs="Arial"/>
+        </w:rPr>
+        <w:t>samenvatting</w:t>
+      </w:r>
+      <w:proofErr w:type="spellEnd"/>
+      <w:r>
+        <w:rPr>
+          <w:rFonts w:ascii="Arial" w:hAnsi="Arial" w:cs="Arial"/>
+        </w:rPr>
+        <w:t>)</w:t>
       </w:r>
     </w:p>
     <w:p>
@@ -1450,7 +1940,35 @@
         <w:rPr>
           <w:rFonts w:ascii="Arial" w:hAnsi="Arial" w:cs="Arial"/>
         </w:rPr>
-        <w:t>Demo run tijdens presentatie/interview</w:t>
+        <w:t xml:space="preserve">Demo run </w:t>
+      </w:r>
+      <w:proofErr w:type="spellStart"/>
+      <w:r>
+        <w:rPr>
+          <w:rFonts w:ascii="Arial" w:hAnsi="Arial" w:cs="Arial"/>
+        </w:rPr>
+        <w:t>tijdens</w:t>
+      </w:r>
+      <w:proofErr w:type="spellEnd"/>
+      <w:r>
+        <w:rPr>
+          <w:rFonts w:ascii="Arial" w:hAnsi="Arial" w:cs="Arial"/>
+        </w:rPr>
+        <w:t xml:space="preserve"> </w:t>
+      </w:r>
+      <w:proofErr w:type="spellStart"/>
+      <w:r>
+        <w:rPr>
+          <w:rFonts w:ascii="Arial" w:hAnsi="Arial" w:cs="Arial"/>
+        </w:rPr>
+        <w:t>presentatie</w:t>
+      </w:r>
+      <w:proofErr w:type="spellEnd"/>
+      <w:r>
+        <w:rPr>
+          <w:rFonts w:ascii="Arial" w:hAnsi="Arial" w:cs="Arial"/>
+        </w:rPr>
+        <w:t>/interview</w:t>
       </w:r>
     </w:p>
     <w:p>
@@ -1478,26 +1996,48 @@
           <w:rFonts w:ascii="Arial" w:hAnsi="Arial" w:cs="Arial"/>
         </w:rPr>
         <w:lastRenderedPageBreak/>
-        <w:t>7. Risicoanalyse en maatregelen</w:t>
+        <w:t xml:space="preserve">7. </w:t>
       </w:r>
-    </w:p>
-    <w:p>
-      <w:pPr>
-        <w:rPr>
-          <w:rFonts w:ascii="Arial" w:hAnsi="Arial" w:cs="Arial"/>
-          <w:lang w:val="nl-NL"/>
-        </w:rPr>
-      </w:pPr>
+      <w:proofErr w:type="spellStart"/>
       <w:r>
         <w:rPr>
           <w:rFonts w:ascii="Arial" w:hAnsi="Arial" w:cs="Arial"/>
-          <w:lang w:val="nl-NL"/>
-        </w:rPr>
-        <w:t>Onderstaande risico’s zijn relevant bij het verplaatsen van FitTrack naar een demo- of productieomgeving. Per risico staat een maatregel om het risico te verkleinen.</w:t>
+        </w:rPr>
+        <w:t>Risicoanalyse</w:t>
       </w:r>
+      <w:proofErr w:type="spellEnd"/>
+      <w:r>
+        <w:rPr>
+          <w:rFonts w:ascii="Arial" w:hAnsi="Arial" w:cs="Arial"/>
+        </w:rPr>
+        <w:t xml:space="preserve"> </w:t>
+      </w:r>
+      <w:proofErr w:type="spellStart"/>
+      <w:r>
+        <w:rPr>
+          <w:rFonts w:ascii="Arial" w:hAnsi="Arial" w:cs="Arial"/>
+        </w:rPr>
+        <w:t>en</w:t>
+      </w:r>
+      <w:proofErr w:type="spellEnd"/>
+      <w:r>
+        <w:rPr>
+          <w:rFonts w:ascii="Arial" w:hAnsi="Arial" w:cs="Arial"/>
+        </w:rPr>
+        <w:t xml:space="preserve"> </w:t>
+      </w:r>
+      <w:proofErr w:type="spellStart"/>
+      <w:r>
+        <w:rPr>
+          <w:rFonts w:ascii="Arial" w:hAnsi="Arial" w:cs="Arial"/>
+        </w:rPr>
+        <w:t>maatregelen</w:t>
+      </w:r>
+      <w:proofErr w:type="spellEnd"/>
     </w:p>
     <w:tbl>
       <w:tblPr>
+        <w:tblpPr w:leftFromText="180" w:rightFromText="180" w:vertAnchor="text" w:horzAnchor="margin" w:tblpY="816"/>
         <w:tblW w:w="0" w:type="auto"/>
         <w:tblBorders>
           <w:top w:val="single" w:sz="4" w:space="0" w:color="auto"/>
@@ -1561,12 +2101,14 @@
                 <w:rFonts w:ascii="Arial" w:hAnsi="Arial" w:cs="Arial"/>
               </w:rPr>
             </w:pPr>
+            <w:proofErr w:type="spellStart"/>
             <w:r>
               <w:rPr>
                 <w:rFonts w:ascii="Arial" w:hAnsi="Arial" w:cs="Arial"/>
               </w:rPr>
               <w:t>Maatregel</w:t>
             </w:r>
+            <w:proofErr w:type="spellEnd"/>
           </w:p>
         </w:tc>
       </w:tr>
@@ -1699,7 +2241,14 @@
                 <w:rFonts w:ascii="Arial" w:hAnsi="Arial" w:cs="Arial"/>
                 <w:lang w:val="nl-NL"/>
               </w:rPr>
-              <w:t>Gebruik dezelfde JDK major versie als getest (bijv. JDK 21). Noteer dit in README en test jar-start op een schone machine.</w:t>
+              <w:t xml:space="preserve">Gebruik dezelfde JDK major versie als getest (bijv. JDK 21). </w:t>
+            </w:r>
+            <w:r>
+              <w:rPr>
+                <w:rFonts w:ascii="Arial" w:hAnsi="Arial" w:cs="Arial"/>
+                <w:lang w:val="nl-NL"/>
+              </w:rPr>
+              <w:t>Noteer dit in README en test de applicatie via IntelliJ of Maven op een schone machine.</w:t>
             </w:r>
           </w:p>
         </w:tc>
@@ -1781,7 +2330,7 @@
                 <w:rFonts w:ascii="Arial" w:hAnsi="Arial" w:cs="Arial"/>
                 <w:lang w:val="nl-NL"/>
               </w:rPr>
-              <w:t>Jar start niet door ontbrekende JavaFX modules</w:t>
+              <w:t>Applicatie start niet door ontbrekende JavaFX modules</w:t>
             </w:r>
           </w:p>
         </w:tc>
@@ -1817,7 +2366,105 @@
               <w:rPr>
                 <w:rFonts w:ascii="Arial" w:hAnsi="Arial" w:cs="Arial"/>
               </w:rPr>
-              <w:t>Build met Maven en test via 'mvn clean test javafx:run' en jar-run. Voeg startinstructies toe in README.</w:t>
+              <w:t xml:space="preserve">Build met Maven </w:t>
+            </w:r>
+            <w:proofErr w:type="spellStart"/>
+            <w:r>
+              <w:rPr>
+                <w:rFonts w:ascii="Arial" w:hAnsi="Arial" w:cs="Arial"/>
+              </w:rPr>
+              <w:t>en</w:t>
+            </w:r>
+            <w:proofErr w:type="spellEnd"/>
+            <w:r>
+              <w:rPr>
+                <w:rFonts w:ascii="Arial" w:hAnsi="Arial" w:cs="Arial"/>
+              </w:rPr>
+              <w:t xml:space="preserve"> test via '</w:t>
+            </w:r>
+            <w:proofErr w:type="spellStart"/>
+            <w:r>
+              <w:rPr>
+                <w:rFonts w:ascii="Arial" w:hAnsi="Arial" w:cs="Arial"/>
+              </w:rPr>
+              <w:t>mvn</w:t>
+            </w:r>
+            <w:proofErr w:type="spellEnd"/>
+            <w:r>
+              <w:rPr>
+                <w:rFonts w:ascii="Arial" w:hAnsi="Arial" w:cs="Arial"/>
+              </w:rPr>
+              <w:t xml:space="preserve"> clean test' </w:t>
+            </w:r>
+            <w:proofErr w:type="spellStart"/>
+            <w:r>
+              <w:rPr>
+                <w:rFonts w:ascii="Arial" w:hAnsi="Arial" w:cs="Arial"/>
+              </w:rPr>
+              <w:t>en</w:t>
+            </w:r>
+            <w:proofErr w:type="spellEnd"/>
+            <w:r>
+              <w:rPr>
+                <w:rFonts w:ascii="Arial" w:hAnsi="Arial" w:cs="Arial"/>
+              </w:rPr>
+              <w:t xml:space="preserve"> '</w:t>
+            </w:r>
+            <w:proofErr w:type="spellStart"/>
+            <w:r>
+              <w:rPr>
+                <w:rFonts w:ascii="Arial" w:hAnsi="Arial" w:cs="Arial"/>
+              </w:rPr>
+              <w:t>mvn</w:t>
+            </w:r>
+            <w:proofErr w:type="spellEnd"/>
+            <w:r>
+              <w:rPr>
+                <w:rFonts w:ascii="Arial" w:hAnsi="Arial" w:cs="Arial"/>
+              </w:rPr>
+              <w:t xml:space="preserve"> clean </w:t>
+            </w:r>
+            <w:proofErr w:type="spellStart"/>
+            <w:r>
+              <w:rPr>
+                <w:rFonts w:ascii="Arial" w:hAnsi="Arial" w:cs="Arial"/>
+              </w:rPr>
+              <w:t>javafx:run</w:t>
+            </w:r>
+            <w:proofErr w:type="spellEnd"/>
+            <w:r>
+              <w:rPr>
+                <w:rFonts w:ascii="Arial" w:hAnsi="Arial" w:cs="Arial"/>
+              </w:rPr>
+              <w:t xml:space="preserve">'. </w:t>
+            </w:r>
+            <w:proofErr w:type="spellStart"/>
+            <w:r>
+              <w:rPr>
+                <w:rFonts w:ascii="Arial" w:hAnsi="Arial" w:cs="Arial"/>
+              </w:rPr>
+              <w:t>Voeg</w:t>
+            </w:r>
+            <w:proofErr w:type="spellEnd"/>
+            <w:r>
+              <w:rPr>
+                <w:rFonts w:ascii="Arial" w:hAnsi="Arial" w:cs="Arial"/>
+              </w:rPr>
+              <w:t xml:space="preserve"> </w:t>
+            </w:r>
+            <w:proofErr w:type="spellStart"/>
+            <w:r>
+              <w:rPr>
+                <w:rFonts w:ascii="Arial" w:hAnsi="Arial" w:cs="Arial"/>
+              </w:rPr>
+              <w:t>startinstructies</w:t>
+            </w:r>
+            <w:proofErr w:type="spellEnd"/>
+            <w:r>
+              <w:rPr>
+                <w:rFonts w:ascii="Arial" w:hAnsi="Arial" w:cs="Arial"/>
+              </w:rPr>
+              <w:t xml:space="preserve"> toe in README.</w:t>
             </w:r>
           </w:p>
         </w:tc>
@@ -1837,8 +2484,44 @@
               <w:rPr>
                 <w:rFonts w:ascii="Arial" w:hAnsi="Arial" w:cs="Arial"/>
               </w:rPr>
-              <w:t>Data consistentie issues (FK errors) bij verwijderen</w:t>
+              <w:t xml:space="preserve">Data </w:t>
             </w:r>
+            <w:proofErr w:type="spellStart"/>
+            <w:r>
+              <w:rPr>
+                <w:rFonts w:ascii="Arial" w:hAnsi="Arial" w:cs="Arial"/>
+              </w:rPr>
+              <w:t>consistentie</w:t>
+            </w:r>
+            <w:proofErr w:type="spellEnd"/>
+            <w:r>
+              <w:rPr>
+                <w:rFonts w:ascii="Arial" w:hAnsi="Arial" w:cs="Arial"/>
+              </w:rPr>
+              <w:t xml:space="preserve"> issues (FK errors) </w:t>
+            </w:r>
+            <w:proofErr w:type="spellStart"/>
+            <w:r>
+              <w:rPr>
+                <w:rFonts w:ascii="Arial" w:hAnsi="Arial" w:cs="Arial"/>
+              </w:rPr>
+              <w:t>bij</w:t>
+            </w:r>
+            <w:proofErr w:type="spellEnd"/>
+            <w:r>
+              <w:rPr>
+                <w:rFonts w:ascii="Arial" w:hAnsi="Arial" w:cs="Arial"/>
+              </w:rPr>
+              <w:t xml:space="preserve"> </w:t>
+            </w:r>
+            <w:proofErr w:type="spellStart"/>
+            <w:r>
+              <w:rPr>
+                <w:rFonts w:ascii="Arial" w:hAnsi="Arial" w:cs="Arial"/>
+              </w:rPr>
+              <w:t>verwijderen</w:t>
+            </w:r>
+            <w:proofErr w:type="spellEnd"/>
           </w:p>
         </w:tc>
         <w:tc>
@@ -1851,12 +2534,14 @@
                 <w:rFonts w:ascii="Arial" w:hAnsi="Arial" w:cs="Arial"/>
               </w:rPr>
             </w:pPr>
+            <w:proofErr w:type="spellStart"/>
             <w:r>
               <w:rPr>
                 <w:rFonts w:ascii="Arial" w:hAnsi="Arial" w:cs="Arial"/>
               </w:rPr>
               <w:t>Laag</w:t>
             </w:r>
+            <w:proofErr w:type="spellEnd"/>
           </w:p>
         </w:tc>
         <w:tc>
@@ -1883,7 +2568,6 @@
     </w:tbl>
     <w:p>
       <w:pPr>
-        <w:pStyle w:val="Heading1"/>
         <w:rPr>
           <w:rFonts w:ascii="Arial" w:hAnsi="Arial" w:cs="Arial"/>
           <w:lang w:val="nl-NL"/>
@@ -1894,6 +2578,71 @@
           <w:rFonts w:ascii="Arial" w:hAnsi="Arial" w:cs="Arial"/>
           <w:lang w:val="nl-NL"/>
         </w:rPr>
+        <w:t>Onderstaande risico’s zijn relevant bij het verplaatsen van FitTrack naar een demo- of productieomgeving. Per risico staat een maatregel om het risico te verkleinen.</w:t>
+      </w:r>
+    </w:p>
+    <w:p>
+      <w:pPr>
+        <w:rPr>
+          <w:rFonts w:ascii="Arial" w:hAnsi="Arial" w:cs="Arial"/>
+          <w:lang w:val="nl-NL"/>
+        </w:rPr>
+      </w:pPr>
+    </w:p>
+    <w:p>
+      <w:pPr>
+        <w:rPr>
+          <w:rFonts w:ascii="Arial" w:hAnsi="Arial" w:cs="Arial"/>
+          <w:lang w:val="nl-NL"/>
+        </w:rPr>
+      </w:pPr>
+    </w:p>
+    <w:p>
+      <w:pPr>
+        <w:rPr>
+          <w:rFonts w:ascii="Arial" w:hAnsi="Arial" w:cs="Arial"/>
+          <w:lang w:val="nl-NL"/>
+        </w:rPr>
+      </w:pPr>
+    </w:p>
+    <w:p>
+      <w:pPr>
+        <w:rPr>
+          <w:rFonts w:ascii="Arial" w:hAnsi="Arial" w:cs="Arial"/>
+          <w:lang w:val="nl-NL"/>
+        </w:rPr>
+      </w:pPr>
+    </w:p>
+    <w:p>
+      <w:pPr>
+        <w:rPr>
+          <w:rFonts w:ascii="Arial" w:hAnsi="Arial" w:cs="Arial"/>
+          <w:lang w:val="nl-NL"/>
+        </w:rPr>
+      </w:pPr>
+    </w:p>
+    <w:p>
+      <w:pPr>
+        <w:rPr>
+          <w:rFonts w:ascii="Arial" w:hAnsi="Arial" w:cs="Arial"/>
+          <w:lang w:val="nl-NL"/>
+        </w:rPr>
+      </w:pPr>
+    </w:p>
+    <w:p>
+      <w:pPr>
+        <w:pStyle w:val="Heading1"/>
+        <w:rPr>
+          <w:rFonts w:ascii="Arial" w:hAnsi="Arial" w:cs="Arial"/>
+          <w:lang w:val="nl-NL"/>
+        </w:rPr>
+      </w:pPr>
+      <w:r>
+        <w:rPr>
+          <w:rFonts w:ascii="Arial" w:hAnsi="Arial" w:cs="Arial"/>
+          <w:lang w:val="nl-NL"/>
+        </w:rPr>
+        <w:lastRenderedPageBreak/>
         <w:t>8. Rollback en herstelplan</w:t>
       </w:r>
     </w:p>
@@ -1939,7 +2688,14 @@
           <w:rFonts w:ascii="Arial" w:hAnsi="Arial" w:cs="Arial"/>
           <w:lang w:val="nl-NL"/>
         </w:rPr>
-        <w:t>- Gebruik de vorige release/tag in GitHub (bijv. v1.0).</w:t>
+        <w:t xml:space="preserve">- </w:t>
+      </w:r>
+      <w:r>
+        <w:rPr>
+          <w:rFonts w:ascii="Arial" w:hAnsi="Arial" w:cs="Arial"/>
+          <w:lang w:val="nl-NL"/>
+        </w:rPr>
+        <w:t>Gebruik de vorige werkende commit op GitHub.</w:t>
       </w:r>
     </w:p>
     <w:p>
@@ -1990,7 +2746,14 @@
           <w:rFonts w:ascii="Arial" w:hAnsi="Arial" w:cs="Arial"/>
           <w:lang w:val="nl-NL"/>
         </w:rPr>
-        <w:t>- Start de applicatie opnieuw met de vorige jar.</w:t>
+        <w:t xml:space="preserve">- </w:t>
+      </w:r>
+      <w:r>
+        <w:rPr>
+          <w:rFonts w:ascii="Arial" w:hAnsi="Arial" w:cs="Arial"/>
+          <w:lang w:val="nl-NL"/>
+        </w:rPr>
+        <w:t>Start de applicatie opnieuw via IntelliJ of Maven.</w:t>
       </w:r>
     </w:p>
     <w:p>
@@ -2005,7 +2768,6 @@
           <w:rFonts w:ascii="Arial" w:hAnsi="Arial" w:cs="Arial"/>
           <w:lang w:val="nl-NL"/>
         </w:rPr>
-        <w:lastRenderedPageBreak/>
         <w:t>- Voer een smoke test uit (user aanmaken, workout + meal toevoegen, overview controleren).</w:t>
       </w:r>
     </w:p>
@@ -2037,7 +2799,7 @@
           <w:rFonts w:ascii="Arial" w:hAnsi="Arial" w:cs="Arial"/>
           <w:lang w:val="nl-NL"/>
         </w:rPr>
-        <w:t>Versiebeheer gebeurt met Git/GitHub. Bij oplevering wordt een release gemaakt zodat altijd duidelijk is welke versie is ingeleverd.</w:t>
+        <w:t>Versiebeheer gebeurt met Git/GitHub. Bij oplevering wordt de laatste versie gepusht, zodat duidelijk is welke versie is ingeleverd.</w:t>
       </w:r>
     </w:p>
     <w:p>
@@ -2052,7 +2814,14 @@
           <w:rFonts w:ascii="Arial" w:hAnsi="Arial" w:cs="Arial"/>
           <w:lang w:val="nl-NL"/>
         </w:rPr>
-        <w:t>- Gebruik een duidelijke tag/versie (bijv. v1.0).</w:t>
+        <w:t xml:space="preserve">- </w:t>
+      </w:r>
+      <w:r>
+        <w:rPr>
+          <w:rFonts w:ascii="Arial" w:hAnsi="Arial" w:cs="Arial"/>
+          <w:lang w:val="nl-NL"/>
+        </w:rPr>
+        <w:t>Controleer dat de laatste versie op GitHub staat.</w:t>
       </w:r>
     </w:p>
     <w:p>
@@ -2087,7 +2856,14 @@
           <w:rFonts w:ascii="Arial" w:hAnsi="Arial" w:cs="Arial"/>
           <w:lang w:val="nl-NL"/>
         </w:rPr>
-        <w:t>- De release bevat: source code, README, SQL export en het artefact (jar).</w:t>
+        <w:t xml:space="preserve">- </w:t>
+      </w:r>
+      <w:r>
+        <w:rPr>
+          <w:rFonts w:ascii="Arial" w:hAnsi="Arial" w:cs="Arial"/>
+          <w:lang w:val="nl-NL"/>
+        </w:rPr>
+        <w:t>De oplevering bevat: source code via GitHub, README, SQL export, testdocumenten en implementatiedocumentatie.</w:t>
       </w:r>
     </w:p>
     <w:p>
@@ -2133,7 +2909,14 @@
           <w:rFonts w:ascii="Arial" w:hAnsi="Arial" w:cs="Arial"/>
           <w:lang w:val="nl-NL"/>
         </w:rPr>
-        <w:t>- Applicatie start zonder errors (java -jar of Maven run).</w:t>
+        <w:t xml:space="preserve">- </w:t>
+      </w:r>
+      <w:r>
+        <w:rPr>
+          <w:rFonts w:ascii="Arial" w:hAnsi="Arial" w:cs="Arial"/>
+          <w:lang w:val="nl-NL"/>
+        </w:rPr>
+        <w:t>Applicatie start zonder errors via IntelliJ of Maven run.</w:t>
       </w:r>
     </w:p>
     <w:p>

</xml_diff>